<commit_message>
Remove PR-AUC metrics across notebooks, scripts, and reports
</commit_message>
<xml_diff>
--- a/Final_Outcomes_Report.docx
+++ b/Final_Outcomes_Report.docx
@@ -39,25 +39,6 @@
         <w:t xml:space="preserve">: 0.6364</w:t>
       </w:r>
     </w:p>
-    <w:p>
-      <w:pPr>
-        <w:pStyle w:val="Compact"/>
-        <w:numPr>
-          <w:ilvl w:val="0"/>
-          <w:numId w:val="1001"/>
-        </w:numPr>
-      </w:pPr>
-      <w:r>
-        <w:rPr>
-          <w:b/>
-          <w:bCs/>
-        </w:rPr>
-        <w:t xml:space="preserve">PR-AUC (Average Precision)</w:t>
-      </w:r>
-      <w:r>
-        <w:t xml:space="preserve">: 0.0726</w:t>
-      </w:r>
-    </w:p>
     <w:bookmarkEnd w:id="9"/>
     <w:bookmarkStart w:id="10" w:name="tuned-xgboost-performance"/>
     <w:p>
@@ -85,25 +66,6 @@
       </w:r>
       <w:r>
         <w:t xml:space="preserve">: 0.6276</w:t>
-      </w:r>
-    </w:p>
-    <w:p>
-      <w:pPr>
-        <w:pStyle w:val="Compact"/>
-        <w:numPr>
-          <w:ilvl w:val="0"/>
-          <w:numId w:val="1002"/>
-        </w:numPr>
-      </w:pPr>
-      <w:r>
-        <w:rPr>
-          <w:b/>
-          <w:bCs/>
-        </w:rPr>
-        <w:t xml:space="preserve">PR-AUC (Average Precision)</w:t>
-      </w:r>
-      <w:r>
-        <w:t xml:space="preserve">: 0.0872</w:t>
       </w:r>
     </w:p>
     <w:bookmarkEnd w:id="10"/>

</xml_diff>